<commit_message>
v10.0.0: Round-14 strict appearance-order restructure
- Methods precede Results; Abstract before Keywords.
- All 16 references and 9 supplementary tables renumbered to first-appearance order (no gaps, sub-panel level).
- Supplementary_Materials reordered S1=provenance ... S9=AMD age; Figure S1=gradability, Figure S2=NHIS; internal cross-refs remapped.
- Run-in body lead-in labels un-bolded (only headings/captions bold).
- verify_v7 239/239, verify_docx_v8 47/47, verify_v10 12/12.
- Code-availability / cover letter / CITATION / zenodo / README bumped to v10.0.0.
</commit_message>
<xml_diff>
--- a/manuscript/cover_letter.docx
+++ b/manuscript/cover_letter.docx
@@ -708,19 +708,19 @@
         <w:rPr>
           <w:rFonts w:ascii="Arial" w:eastAsia="Microsoft YaHei"/>
         </w:rPr>
-        <w:t xml:space="preserve">repository — https://github.com/teamhuang/eye3-nhanes-diagnosis-care-gap (release v9.0.0:</w:t>
-      </w:r>
-    </w:p>
-    <w:p>
-      <w:pPr>
-        <w:spacing w:after="120" w:line="360" w:lineRule="auto"/>
-        <w:ind w:firstLine="480"/>
-      </w:pPr>
-      <w:r>
-        <w:rPr>
-          <w:rFonts w:ascii="Arial" w:eastAsia="Microsoft YaHei"/>
-        </w:rPr>
-        <w:t xml:space="preserve">https://github.com/teamhuang/eye3-nhanes-diagnosis-care-gap/releases/tag/v9.0.0) — and is intended to be</w:t>
+        <w:t xml:space="preserve">repository — https://github.com/teamhuang/eye3-nhanes-diagnosis-care-gap (release v10.0.0:</w:t>
+      </w:r>
+    </w:p>
+    <w:p>
+      <w:pPr>
+        <w:spacing w:after="120" w:line="360" w:lineRule="auto"/>
+        <w:ind w:firstLine="480"/>
+      </w:pPr>
+      <w:r>
+        <w:rPr>
+          <w:rFonts w:ascii="Arial" w:eastAsia="Microsoft YaHei"/>
+        </w:rPr>
+        <w:t xml:space="preserve">https://github.com/teamhuang/eye3-nhanes-diagnosis-care-gap/releases/tag/v10.0.0) — and is intended to be</w:t>
       </w:r>
     </w:p>
     <w:p>

</xml_diff>